<commit_message>
Business case PDF/Word: 80,000 baseline, Kenvue, small cut big impact, Phase 2
Co-Authored-By: Claude Opus 5.5 <noreply@anthropic.com>
Claude-Session: https://claude.ai/code/session_01RqjYH8thgypqaznYvmJkNY
</commit_message>
<xml_diff>
--- a/docs/JnJ_Business_Case_Final.docx
+++ b/docs/JnJ_Business_Case_Final.docx
@@ -13,7 +13,7 @@
     <w:p>
       <w:pPr/>
       <w:r>
-        <w:t xml:space="preserve">Oct 22, 2026</w:t>
+        <w:t xml:space="preserve">Oct 29, 2026</w:t>
       </w:r>
       <w:r>
         <w:t xml:space="preserve"> · </w:t>
@@ -36,76 +36,85 @@
         <w:rPr>
           <w:b/>
         </w:rPr>
-        <w:t xml:space="preserve">Recommendation:</w:t>
-      </w:r>
-      <w:r>
-        <w:t xml:space="preserve"> cut J&amp;J's active supplier base by more than half and put every retained supplier on the agreement its category calls for. Tested on </w:t>
+        <w:t xml:space="preserve">Recommendation: small cut, big impact.</w:t>
+      </w:r>
+      <w:r>
+        <w:t xml:space="preserve"> Every supplier cut has to be justified and defended with the people who buy from it, so start with the cuts that are easiest to defend: merge duplicate records and move one-time vendors to catalogs. That cuts </w:t>
       </w:r>
       <w:r>
         <w:rPr>
           <w:b/>
         </w:rPr>
-        <w:t xml:space="preserve">real procurement data</w:t>
-      </w:r>
-      <w:r>
-        <w:t xml:space="preserve"> (16,933 suppliers, $7.3B a year), the rules keep </w:t>
+        <w:t xml:space="preserve">27% of active suppliers</w:t>
+      </w:r>
+      <w:r>
+        <w:t xml:space="preserve"> and still captures </w:t>
       </w:r>
       <w:r>
         <w:rPr>
           <w:b/>
         </w:rPr>
-        <w:t xml:space="preserve">4,648 suppliers (−73% of records, −59% of the active base)</w:t>
-      </w:r>
-      <w:r>
-        <w:t xml:space="preserve"> while keeping </w:t>
+        <w:t xml:space="preserve">$356M a year, 86% of the base-case value</w:t>
+      </w:r>
+      <w:r>
+        <w:t xml:space="preserve">, for $34M one-time. Then re-tender the </w:t>
       </w:r>
       <w:r>
         <w:rPr>
           <w:b/>
         </w:rPr>
-        <w:t xml:space="preserve">87% of spend</w:t>
-      </w:r>
-      <w:r>
-        <w:t xml:space="preserve"> and </w:t>
-      </w:r>
+        <w:t xml:space="preserve">~150 largest Leverage suppliers</w:t>
+      </w:r>
+      <w:r>
+        <w:t xml:space="preserve">, who hold 80% of the spend the re-tender saving applies to.</w:t>
+      </w:r>
+    </w:p>
+    <w:p>
+      <w:pPr/>
       <w:r>
         <w:rPr>
           <w:b/>
         </w:rPr>
-        <w:t xml:space="preserve">96.6% of active small/diverse spend</w:t>
-      </w:r>
-      <w:r>
-        <w:t xml:space="preserve"> with retained suppliers.</w:t>
-      </w:r>
-    </w:p>
-    <w:p>
-      <w:pPr/>
+        <w:t xml:space="preserve">Where J&amp;J is today:</w:t>
+      </w:r>
+      <w:r>
+        <w:t xml:space="preserve"> J&amp;J was quoted at </w:t>
+      </w:r>
       <w:r>
         <w:rPr>
           <w:b/>
         </w:rPr>
-        <w:t xml:space="preserve">Value at J&amp;J scale (base case): $366M a year</w:t>
-      </w:r>
-      <w:r>
-        <w:t xml:space="preserve"> in run-rate savings for </w:t>
+        <w:t xml:space="preserve">80,000 suppliers</w:t>
+      </w:r>
+      <w:r>
+        <w:t xml:space="preserve"> (around 2021, before the Kenvue spin-off) and reports </w:t>
       </w:r>
       <w:r>
         <w:rPr>
           <w:b/>
         </w:rPr>
-        <w:t xml:space="preserve">$40M one-time cost</w:t>
-      </w:r>
-      <w:r>
-        <w:t xml:space="preserve">, a 3-year NPV of </w:t>
+        <w:t xml:space="preserve">~39,000</w:t>
+      </w:r>
+      <w:r>
+        <w:t xml:space="preserve"> for FY2025. The 2023 Kenvue spin-off took an estimated 12,600–24,000 suppliers; the rest is a </w:t>
       </w:r>
       <w:r>
         <w:rPr>
           <w:b/>
         </w:rPr>
-        <w:t xml:space="preserve">$572M</w:t>
-      </w:r>
-      <w:r>
-        <w:t xml:space="preserve">. The original top-down estimate was $385M, so the headline holds, but the mix is different:</w:t>
+        <w:t xml:space="preserve">30–42% reduction</w:t>
+      </w:r>
+      <w:r>
+        <w:t xml:space="preserve">, the size our rules produce on 344,504 real purchase orders. From ~39,000, a category-level target model takes J&amp;J to </w:t>
+      </w:r>
+      <w:r>
+        <w:rPr>
+          <w:b/>
+        </w:rPr>
+        <w:t xml:space="preserve">~32,100</w:t>
+      </w:r>
+      <w:r>
+        <w:t xml:space="preserve">.</w:t>
       </w:r>
     </w:p>
     <w:p>
@@ -120,10 +129,28 @@
         <w:rPr>
           <w:b/>
         </w:rPr>
-        <w:t xml:space="preserve">$86M a year is measured in the data</w:t>
-      </w:r>
-      <w:r>
-        <w:t xml:space="preserve">: a 5–10% price gap on spend moved from small suppliers in leverage and non-critical categories, plus fewer suppliers to maintain.</w:t>
+        <w:t xml:space="preserve">Measured vs assumed:</w:t>
+      </w:r>
+      <w:r>
+        <w:t xml:space="preserve"> in the base plan (−44%) savings are $414M a year, of which </w:t>
+      </w:r>
+      <w:r>
+        <w:rPr>
+          <w:b/>
+        </w:rPr>
+        <w:t xml:space="preserve">$134M is measured</w:t>
+      </w:r>
+      <w:r>
+        <w:t xml:space="preserve"> in the data; the $300M goal needs a re-tender saving of </w:t>
+      </w:r>
+      <w:r>
+        <w:rPr>
+          <w:b/>
+        </w:rPr>
+        <w:t xml:space="preserve">at least 0.89%</w:t>
+      </w:r>
+      <w:r>
+        <w:t xml:space="preserve"> (1.2% in the conservative plan). These are cost savings, so they show up in operating profit, not revenue.</w:t>
       </w:r>
     </w:p>
     <w:p>
@@ -138,19 +165,10 @@
         <w:rPr>
           <w:b/>
         </w:rPr>
-        <w:t xml:space="preserve">$280M depends on one assumption</w:t>
-      </w:r>
-      <w:r>
-        <w:t xml:space="preserve">: re-tendering the suppliers we keep in leverage categories. To reach the </w:t>
-      </w:r>
-      <w:r>
-        <w:rPr>
-          <w:b/>
-        </w:rPr>
-        <w:t xml:space="preserve">$300M goal, that re-tender must save at least 1.15%</w:t>
-      </w:r>
-      <w:r>
-        <w:t xml:space="preserve">. That is the first thing to test in a pilot.</w:t>
+        <w:t xml:space="preserve">Cutting deeper adds little:</w:t>
+      </w:r>
+      <w:r>
+        <w:t xml:space="preserve"> going from 27% to 44% cuts 13,700 more suppliers for $58M a year; going to 52% adds 6,200 more for $12M, and adds supply risk.</w:t>
       </w:r>
     </w:p>
     <w:p>
@@ -185,7 +203,7 @@
         <w:t xml:space="preserve">Goal:</w:t>
       </w:r>
       <w:r>
-        <w:t xml:space="preserve"> decide which of J&amp;J's ~29,000 suppliers to keep, consolidate or exit, with a data reason behind every exit, and show the result saves at least $300M a year without adding supply risk.</w:t>
+        <w:t xml:space="preserve"> decide which suppliers J&amp;J should keep, consolidate or exit, with a data reason behind every decision; find the plan that captures most of the value with the fewest cuts; and measure any supply risk the plan adds.</w:t>
       </w:r>
     </w:p>
     <w:p>
@@ -722,7 +740,7 @@
     <w:p>
       <w:pPr/>
       <w:r>
-        <w:t xml:space="preserve">J&amp;J already runs a large, shrinking supplier base: about 29,000 suppliers in 2024, down from 38,500 in 2023, after the 2023 separation of its consumer business (Kenvue).</w:t>
+        <w:t xml:space="preserve">J&amp;J's supplier count has moved a lot, with the business and with how suppliers are counted:</w:t>
       </w:r>
     </w:p>
     <w:tbl>
@@ -733,9 +751,9 @@
         <w:tblLook w:val="04A0" w:firstRow="1" w:lastRow="0" w:firstColumn="0" w:lastColumn="0" w:noHBand="0" w:noVBand="1"/>
       </w:tblPr>
       <w:tblGrid>
-        <w:gridCol w:w="3253"/>
-        <w:gridCol w:w="2034"/>
-        <w:gridCol w:w="4073"/>
+        <w:gridCol w:w="2576"/>
+        <w:gridCol w:w="1352"/>
+        <w:gridCol w:w="5431"/>
       </w:tblGrid>
       <w:tr>
         <w:trPr>
@@ -743,31 +761,31 @@
         </w:trPr>
         <w:tc>
           <w:tcPr>
-            <w:tcW w:w="3253" w:type="dxa"/>
+            <w:tcW w:w="2576" w:type="dxa"/>
             <w:shd w:val="clear" w:color="auto" w:fill="F2F2F2"/>
           </w:tcPr>
           <w:p>
             <w:pPr/>
             <w:r>
-              <w:t xml:space="preserve">Metric</w:t>
-            </w:r>
-          </w:p>
-        </w:tc>
-        <w:tc>
-          <w:tcPr>
-            <w:tcW w:w="2034" w:type="dxa"/>
+              <w:t xml:space="preserve">When</w:t>
+            </w:r>
+          </w:p>
+        </w:tc>
+        <w:tc>
+          <w:tcPr>
+            <w:tcW w:w="1352" w:type="dxa"/>
             <w:shd w:val="clear" w:color="auto" w:fill="F2F2F2"/>
           </w:tcPr>
           <w:p>
             <w:pPr/>
             <w:r>
-              <w:t xml:space="preserve">Value</w:t>
-            </w:r>
-          </w:p>
-        </w:tc>
-        <w:tc>
-          <w:tcPr>
-            <w:tcW w:w="4073" w:type="dxa"/>
+              <w:t xml:space="preserve">Suppliers</w:t>
+            </w:r>
+          </w:p>
+        </w:tc>
+        <w:tc>
+          <w:tcPr>
+            <w:tcW w:w="5431" w:type="dxa"/>
             <w:shd w:val="clear" w:color="auto" w:fill="F2F2F2"/>
           </w:tcPr>
           <w:p>
@@ -781,18 +799,136 @@
       <w:tr>
         <w:tc>
           <w:tcPr>
-            <w:tcW w:w="3253" w:type="dxa"/>
-          </w:tcPr>
-          <w:p>
-            <w:pPr/>
-            <w:r>
-              <w:t xml:space="preserve">Suppliers, 2024</w:t>
-            </w:r>
-          </w:p>
-        </w:tc>
-        <w:tc>
-          <w:tcPr>
-            <w:tcW w:w="2034" w:type="dxa"/>
+            <w:tcW w:w="2576" w:type="dxa"/>
+          </w:tcPr>
+          <w:p>
+            <w:pPr/>
+            <w:r>
+              <w:t xml:space="preserve">After 2014 (undated)</w:t>
+            </w:r>
+          </w:p>
+        </w:tc>
+        <w:tc>
+          <w:tcPr>
+            <w:tcW w:w="1352" w:type="dxa"/>
+          </w:tcPr>
+          <w:p>
+            <w:pPr/>
+            <w:r>
+              <w:t xml:space="preserve">80,000</w:t>
+            </w:r>
+          </w:p>
+        </w:tc>
+        <w:tc>
+          <w:tcPr>
+            <w:tcW w:w="5431" w:type="dxa"/>
+          </w:tcPr>
+          <w:p>
+            <w:pPr/>
+            <w:hyperlink r:id="rId3" w:history="1">
+              <w:r>
+                <w:rPr>
+                  <w:rStyle w:val="Hyperlink"/>
+                </w:rPr>
+                <w:t xml:space="preserve">State of Flux case study</w:t>
+              </w:r>
+            </w:hyperlink>
+          </w:p>
+        </w:tc>
+      </w:tr>
+      <w:tr>
+        <w:tc>
+          <w:tcPr>
+            <w:tcW w:w="2576" w:type="dxa"/>
+          </w:tcPr>
+          <w:p>
+            <w:pPr/>
+            <w:r>
+              <w:t xml:space="preserve">2021</w:t>
+            </w:r>
+          </w:p>
+        </w:tc>
+        <w:tc>
+          <w:tcPr>
+            <w:tcW w:w="1352" w:type="dxa"/>
+          </w:tcPr>
+          <w:p>
+            <w:pPr/>
+            <w:r>
+              <w:t xml:space="preserve">78,000+</w:t>
+            </w:r>
+          </w:p>
+        </w:tc>
+        <w:tc>
+          <w:tcPr>
+            <w:tcW w:w="5431" w:type="dxa"/>
+          </w:tcPr>
+          <w:p>
+            <w:pPr/>
+            <w:hyperlink r:id="rId4" w:history="1">
+              <w:r>
+                <w:rPr>
+                  <w:rStyle w:val="Hyperlink"/>
+                </w:rPr>
+                <w:t xml:space="preserve">ArcGIS StoryMap</w:t>
+              </w:r>
+            </w:hyperlink>
+            <w:r>
+              <w:t xml:space="preserve"> (individual author, no source given)</w:t>
+            </w:r>
+          </w:p>
+        </w:tc>
+      </w:tr>
+      <w:tr>
+        <w:tc>
+          <w:tcPr>
+            <w:tcW w:w="2576" w:type="dxa"/>
+          </w:tcPr>
+          <w:p>
+            <w:pPr/>
+            <w:r>
+              <w:t xml:space="preserve">2023</w:t>
+            </w:r>
+          </w:p>
+        </w:tc>
+        <w:tc>
+          <w:tcPr>
+            <w:tcW w:w="1352" w:type="dxa"/>
+          </w:tcPr>
+          <w:p>
+            <w:pPr/>
+            <w:r>
+              <w:t xml:space="preserve">38,500+</w:t>
+            </w:r>
+          </w:p>
+        </w:tc>
+        <w:tc>
+          <w:tcPr>
+            <w:tcW w:w="5431" w:type="dxa"/>
+          </w:tcPr>
+          <w:p>
+            <w:pPr/>
+            <w:r>
+              <w:t xml:space="preserve">2023 Health for Humanity Report; Kenvue separated (IPO May, completed 23 Aug)</w:t>
+            </w:r>
+          </w:p>
+        </w:tc>
+      </w:tr>
+      <w:tr>
+        <w:tc>
+          <w:tcPr>
+            <w:tcW w:w="2576" w:type="dxa"/>
+          </w:tcPr>
+          <w:p>
+            <w:pPr/>
+            <w:r>
+              <w:t xml:space="preserve">2024</w:t>
+            </w:r>
+          </w:p>
+        </w:tc>
+        <w:tc>
+          <w:tcPr>
+            <w:tcW w:w="1352" w:type="dxa"/>
           </w:tcPr>
           <w:p>
             <w:pPr/>
@@ -803,11 +939,11 @@
         </w:tc>
         <w:tc>
           <w:tcPr>
-            <w:tcW w:w="4073" w:type="dxa"/>
-          </w:tcPr>
-          <w:p>
-            <w:pPr/>
-            <w:hyperlink r:id="rId3" w:history="1">
+            <w:tcW w:w="5431" w:type="dxa"/>
+          </w:tcPr>
+          <w:p>
+            <w:pPr/>
+            <w:hyperlink r:id="rId5" w:history="1">
               <w:r>
                 <w:rPr>
                   <w:rStyle w:val="Hyperlink"/>
@@ -821,109 +957,29 @@
       <w:tr>
         <w:tc>
           <w:tcPr>
-            <w:tcW w:w="3253" w:type="dxa"/>
-          </w:tcPr>
-          <w:p>
-            <w:pPr/>
-            <w:r>
-              <w:t xml:space="preserve">Suppliers, 2023</w:t>
-            </w:r>
-          </w:p>
-        </w:tc>
-        <w:tc>
-          <w:tcPr>
-            <w:tcW w:w="2034" w:type="dxa"/>
-          </w:tcPr>
-          <w:p>
-            <w:pPr/>
-            <w:r>
-              <w:t xml:space="preserve">38,500+</w:t>
-            </w:r>
-          </w:p>
-        </w:tc>
-        <w:tc>
-          <w:tcPr>
-            <w:tcW w:w="4073" w:type="dxa"/>
-          </w:tcPr>
-          <w:p>
-            <w:pPr/>
-            <w:hyperlink r:id="rId4" w:history="1">
-              <w:r>
-                <w:rPr>
-                  <w:rStyle w:val="Hyperlink"/>
-                </w:rPr>
-                <w:t xml:space="preserve">2023 Health for Humanity Report</w:t>
-              </w:r>
-            </w:hyperlink>
-          </w:p>
-        </w:tc>
-      </w:tr>
-      <w:tr>
-        <w:tc>
-          <w:tcPr>
-            <w:tcW w:w="3253" w:type="dxa"/>
-          </w:tcPr>
-          <w:p>
-            <w:pPr/>
-            <w:r>
-              <w:t xml:space="preserve">Spend under procurement process</w:t>
-            </w:r>
-          </w:p>
-        </w:tc>
-        <w:tc>
-          <w:tcPr>
-            <w:tcW w:w="2034" w:type="dxa"/>
-          </w:tcPr>
-          <w:p>
-            <w:pPr/>
-            <w:r>
-              <w:t xml:space="preserve">~$35B across ~35,000 suppliers</w:t>
-            </w:r>
-          </w:p>
-        </w:tc>
-        <w:tc>
-          <w:tcPr>
-            <w:tcW w:w="4073" w:type="dxa"/>
-          </w:tcPr>
-          <w:p>
-            <w:pPr/>
-            <w:hyperlink r:id="rId5" w:history="1">
-              <w:r>
-                <w:rPr>
-                  <w:rStyle w:val="Hyperlink"/>
-                </w:rPr>
-                <w:t xml:space="preserve">J&amp;J job posting, Procurement Global Process Owner</w:t>
-              </w:r>
-            </w:hyperlink>
-          </w:p>
-        </w:tc>
-      </w:tr>
-      <w:tr>
-        <w:tc>
-          <w:tcPr>
-            <w:tcW w:w="3253" w:type="dxa"/>
-          </w:tcPr>
-          <w:p>
-            <w:pPr/>
-            <w:r>
-              <w:t xml:space="preserve">Tier 1 diverse supplier spend, 2022</w:t>
-            </w:r>
-          </w:p>
-        </w:tc>
-        <w:tc>
-          <w:tcPr>
-            <w:tcW w:w="2034" w:type="dxa"/>
-          </w:tcPr>
-          <w:p>
-            <w:pPr/>
-            <w:r>
-              <w:t xml:space="preserve">$3B</w:t>
-            </w:r>
-          </w:p>
-        </w:tc>
-        <w:tc>
-          <w:tcPr>
-            <w:tcW w:w="4073" w:type="dxa"/>
+            <w:tcW w:w="2576" w:type="dxa"/>
+          </w:tcPr>
+          <w:p>
+            <w:pPr/>
+            <w:r>
+              <w:t xml:space="preserve">FY2025</w:t>
+            </w:r>
+          </w:p>
+        </w:tc>
+        <w:tc>
+          <w:tcPr>
+            <w:tcW w:w="1352" w:type="dxa"/>
+          </w:tcPr>
+          <w:p>
+            <w:pPr/>
+            <w:r>
+              <w:t xml:space="preserve">~39,000</w:t>
+            </w:r>
+          </w:p>
+        </w:tc>
+        <w:tc>
+          <w:tcPr>
+            <w:tcW w:w="5431" w:type="dxa"/>
           </w:tcPr>
           <w:p>
             <w:pPr/>
@@ -932,49 +988,12 @@
                 <w:rPr>
                   <w:rStyle w:val="Hyperlink"/>
                 </w:rPr>
-                <w:t xml:space="preserve">J&amp;J DEI in our supply base</w:t>
+                <w:t xml:space="preserve">Global Modern Slavery Statement 2025</w:t>
               </w:r>
             </w:hyperlink>
-          </w:p>
-        </w:tc>
-      </w:tr>
-      <w:tr>
-        <w:tc>
-          <w:tcPr>
-            <w:tcW w:w="3253" w:type="dxa"/>
-          </w:tcPr>
-          <w:p>
-            <w:pPr/>
-            <w:r>
-              <w:t xml:space="preserve">Billion Dollar Roundtable member</w:t>
-            </w:r>
-          </w:p>
-        </w:tc>
-        <w:tc>
-          <w:tcPr>
-            <w:tcW w:w="2034" w:type="dxa"/>
-          </w:tcPr>
-          <w:p>
-            <w:pPr/>
-            <w:r>
-              <w:t xml:space="preserve">13 consecutive years (2023)</w:t>
-            </w:r>
-          </w:p>
-        </w:tc>
-        <w:tc>
-          <w:tcPr>
-            <w:tcW w:w="4073" w:type="dxa"/>
-          </w:tcPr>
-          <w:p>
-            <w:pPr/>
-            <w:hyperlink r:id="rId7" w:history="1">
-              <w:r>
-                <w:rPr>
-                  <w:rStyle w:val="Hyperlink"/>
-                </w:rPr>
-                <w:t xml:space="preserve">2023 supplier diversity page</w:t>
-              </w:r>
-            </w:hyperlink>
+            <w:r>
+              <w:t xml:space="preserve"> (new counting method)</w:t>
+            </w:r>
           </w:p>
         </w:tc>
       </w:tr>
@@ -982,7 +1001,16 @@
     <w:p>
       <w:pPr/>
       <w:r>
-        <w:t xml:space="preserve">The often-quoted figure of 80,000 suppliers appears to be an older, pre-separation number. This case uses the current ~29,000 baseline; the model re-runs on any baseline.</w:t>
+        <w:t xml:space="preserve">This case starts from </w:t>
+      </w:r>
+      <w:r>
+        <w:rPr>
+          <w:b/>
+        </w:rPr>
+        <w:t xml:space="preserve">80,000</w:t>
+      </w:r>
+      <w:r>
+        <w:t xml:space="preserve">. Kenvue publishes no supplier count, so its share is estimated: 15.7% if in line with Consumer Health's share of J&amp;J's 2022 sales ($14,953M of $94,943M), 30% as a high case. That leaves 56,000–67,400 J&amp;J suppliers and a reduction of 30–42% to reach ~39,000.</w:t>
       </w:r>
     </w:p>
     <w:p>
@@ -1088,7 +1116,7 @@
     <w:p>
       <w:pPr/>
       <w:r>
-        <w:t xml:space="preserve">Segment suppliers by spend, then apply a different rule to each segment. Strategic suppliers are kept and deepened; the core is consolidated by category; the tail is moved to preferred vendors and catalogs.</w:t>
+        <w:t xml:space="preserve">Count one year of active suppliers (the basis of J&amp;J's reported counts) and sort the reductions into three tiers, from easiest to hardest to defend. Same savings rates in every tier:</w:t>
       </w:r>
     </w:p>
     <w:tbl>
@@ -1099,13 +1127,11 @@
         <w:tblLook w:val="04A0" w:firstRow="1" w:lastRow="0" w:firstColumn="0" w:lastColumn="0" w:noHBand="0" w:noVBand="1"/>
       </w:tblPr>
       <w:tblGrid>
-        <w:gridCol w:w="1186"/>
-        <w:gridCol w:w="1225"/>
-        <w:gridCol w:w="910"/>
-        <w:gridCol w:w="830"/>
-        <w:gridCol w:w="1305"/>
-        <w:gridCol w:w="1225"/>
-        <w:gridCol w:w="2678"/>
+        <w:gridCol w:w="1754"/>
+        <w:gridCol w:w="2882"/>
+        <w:gridCol w:w="1237"/>
+        <w:gridCol w:w="1780"/>
+        <w:gridCol w:w="1707"/>
       </w:tblGrid>
       <w:tr>
         <w:trPr>
@@ -1113,330 +1139,69 @@
         </w:trPr>
         <w:tc>
           <w:tcPr>
-            <w:tcW w:w="1186" w:type="dxa"/>
+            <w:tcW w:w="1754" w:type="dxa"/>
             <w:shd w:val="clear" w:color="auto" w:fill="F2F2F2"/>
           </w:tcPr>
           <w:p>
             <w:pPr/>
             <w:r>
-              <w:t xml:space="preserve">Segment</w:t>
-            </w:r>
-          </w:p>
-        </w:tc>
-        <w:tc>
-          <w:tcPr>
-            <w:tcW w:w="1225" w:type="dxa"/>
+              <w:t xml:space="preserve">Tier</w:t>
+            </w:r>
+          </w:p>
+        </w:tc>
+        <w:tc>
+          <w:tcPr>
+            <w:tcW w:w="2882" w:type="dxa"/>
             <w:shd w:val="clear" w:color="auto" w:fill="F2F2F2"/>
           </w:tcPr>
           <w:p>
             <w:pPr/>
             <w:r>
-              <w:t xml:space="preserve">Suppliers</w:t>
-            </w:r>
-          </w:p>
-        </w:tc>
-        <w:tc>
-          <w:tcPr>
-            <w:tcW w:w="910" w:type="dxa"/>
+              <w:t xml:space="preserve">What changes</w:t>
+            </w:r>
+          </w:p>
+        </w:tc>
+        <w:tc>
+          <w:tcPr>
+            <w:tcW w:w="1237" w:type="dxa"/>
             <w:shd w:val="clear" w:color="auto" w:fill="F2F2F2"/>
           </w:tcPr>
           <w:p>
             <w:pPr/>
             <w:r>
-              <w:t xml:space="preserve">Spend ($M)</w:t>
-            </w:r>
-          </w:p>
-        </w:tc>
-        <w:tc>
-          <w:tcPr>
-            <w:tcW w:w="830" w:type="dxa"/>
+              <w:t xml:space="preserve">Suppliers cut (of 80,000)</w:t>
+            </w:r>
+          </w:p>
+        </w:tc>
+        <w:tc>
+          <w:tcPr>
+            <w:tcW w:w="1780" w:type="dxa"/>
             <w:shd w:val="clear" w:color="auto" w:fill="F2F2F2"/>
           </w:tcPr>
           <w:p>
             <w:pPr/>
             <w:r>
-              <w:t xml:space="preserve">Share of spend</w:t>
-            </w:r>
-          </w:p>
-        </w:tc>
-        <w:tc>
-          <w:tcPr>
-            <w:tcW w:w="1305" w:type="dxa"/>
+              <w:t xml:space="preserve">Savings a year</w:t>
+            </w:r>
+          </w:p>
+        </w:tc>
+        <w:tc>
+          <w:tcPr>
+            <w:tcW w:w="1707" w:type="dxa"/>
             <w:shd w:val="clear" w:color="auto" w:fill="F2F2F2"/>
           </w:tcPr>
           <w:p>
             <w:pPr/>
             <w:r>
-              <w:t xml:space="preserve">Target cut</w:t>
-            </w:r>
-          </w:p>
-        </w:tc>
-        <w:tc>
-          <w:tcPr>
-            <w:tcW w:w="1225" w:type="dxa"/>
-            <w:shd w:val="clear" w:color="auto" w:fill="F2F2F2"/>
-          </w:tcPr>
-          <w:p>
-            <w:pPr/>
-            <w:r>
-              <w:t xml:space="preserve">Suppliers after</w:t>
-            </w:r>
-          </w:p>
-        </w:tc>
-        <w:tc>
-          <w:tcPr>
-            <w:tcW w:w="2678" w:type="dxa"/>
-            <w:shd w:val="clear" w:color="auto" w:fill="F2F2F2"/>
-          </w:tcPr>
-          <w:p>
-            <w:pPr/>
-            <w:r>
-              <w:t xml:space="preserve">Treatment</w:t>
-            </w:r>
-          </w:p>
-        </w:tc>
-      </w:tr>
-      <w:tr>
-        <w:tc>
-          <w:tcPr>
-            <w:tcW w:w="1186" w:type="dxa"/>
-          </w:tcPr>
-          <w:p>
-            <w:pPr/>
-            <w:r>
-              <w:t xml:space="preserve">A Strategic</w:t>
-            </w:r>
-          </w:p>
-        </w:tc>
-        <w:tc>
-          <w:tcPr>
-            <w:tcW w:w="1225" w:type="dxa"/>
-          </w:tcPr>
-          <w:p>
-            <w:pPr/>
-            <w:r>
-              <w:t xml:space="preserve">580</w:t>
-            </w:r>
-          </w:p>
-        </w:tc>
-        <w:tc>
-          <w:tcPr>
-            <w:tcW w:w="910" w:type="dxa"/>
-          </w:tcPr>
-          <w:p>
-            <w:pPr/>
-            <w:r>
-              <w:t xml:space="preserve">24,500</w:t>
-            </w:r>
-          </w:p>
-        </w:tc>
-        <w:tc>
-          <w:tcPr>
-            <w:tcW w:w="830" w:type="dxa"/>
-          </w:tcPr>
-          <w:p>
-            <w:pPr/>
-            <w:r>
-              <w:t xml:space="preserve">70%</w:t>
-            </w:r>
-          </w:p>
-        </w:tc>
-        <w:tc>
-          <w:tcPr>
-            <w:tcW w:w="1305" w:type="dxa"/>
-          </w:tcPr>
-          <w:p>
-            <w:pPr/>
-            <w:r>
-              <w:t xml:space="preserve">0%</w:t>
-            </w:r>
-          </w:p>
-        </w:tc>
-        <w:tc>
-          <w:tcPr>
-            <w:tcW w:w="1225" w:type="dxa"/>
-          </w:tcPr>
-          <w:p>
-            <w:pPr/>
-            <w:r>
-              <w:t xml:space="preserve">580</w:t>
-            </w:r>
-          </w:p>
-        </w:tc>
-        <w:tc>
-          <w:tcPr>
-            <w:tcW w:w="2678" w:type="dxa"/>
-          </w:tcPr>
-          <w:p>
-            <w:pPr/>
-            <w:r>
-              <w:t xml:space="preserve">Partnership agreements, joint value engineering</w:t>
-            </w:r>
-          </w:p>
-        </w:tc>
-      </w:tr>
-      <w:tr>
-        <w:tc>
-          <w:tcPr>
-            <w:tcW w:w="1186" w:type="dxa"/>
-          </w:tcPr>
-          <w:p>
-            <w:pPr/>
-            <w:r>
-              <w:t xml:space="preserve">B Core</w:t>
-            </w:r>
-          </w:p>
-        </w:tc>
-        <w:tc>
-          <w:tcPr>
-            <w:tcW w:w="1225" w:type="dxa"/>
-          </w:tcPr>
-          <w:p>
-            <w:pPr/>
-            <w:r>
-              <w:t xml:space="preserve">3,770</w:t>
-            </w:r>
-          </w:p>
-        </w:tc>
-        <w:tc>
-          <w:tcPr>
-            <w:tcW w:w="910" w:type="dxa"/>
-          </w:tcPr>
-          <w:p>
-            <w:pPr/>
-            <w:r>
-              <w:t xml:space="preserve">7,700</w:t>
-            </w:r>
-          </w:p>
-        </w:tc>
-        <w:tc>
-          <w:tcPr>
-            <w:tcW w:w="830" w:type="dxa"/>
-          </w:tcPr>
-          <w:p>
-            <w:pPr/>
-            <w:r>
-              <w:t xml:space="preserve">22%</w:t>
-            </w:r>
-          </w:p>
-        </w:tc>
-        <w:tc>
-          <w:tcPr>
-            <w:tcW w:w="1305" w:type="dxa"/>
-          </w:tcPr>
-          <w:p>
-            <w:pPr/>
-            <w:r>
-              <w:t xml:space="preserve">25%</w:t>
-            </w:r>
-          </w:p>
-        </w:tc>
-        <w:tc>
-          <w:tcPr>
-            <w:tcW w:w="1225" w:type="dxa"/>
-          </w:tcPr>
-          <w:p>
-            <w:pPr/>
-            <w:r>
-              <w:t xml:space="preserve">2,828</w:t>
-            </w:r>
-          </w:p>
-        </w:tc>
-        <w:tc>
-          <w:tcPr>
-            <w:tcW w:w="2678" w:type="dxa"/>
-          </w:tcPr>
-          <w:p>
-            <w:pPr/>
-            <w:r>
-              <w:t xml:space="preserve">Consolidate per category to 2–3 preferred suppliers</w:t>
-            </w:r>
-          </w:p>
-        </w:tc>
-      </w:tr>
-      <w:tr>
-        <w:tc>
-          <w:tcPr>
-            <w:tcW w:w="1186" w:type="dxa"/>
-          </w:tcPr>
-          <w:p>
-            <w:pPr/>
-            <w:r>
-              <w:t xml:space="preserve">C Tail</w:t>
-            </w:r>
-          </w:p>
-        </w:tc>
-        <w:tc>
-          <w:tcPr>
-            <w:tcW w:w="1225" w:type="dxa"/>
-          </w:tcPr>
-          <w:p>
-            <w:pPr/>
-            <w:r>
-              <w:t xml:space="preserve">24,650</w:t>
-            </w:r>
-          </w:p>
-        </w:tc>
-        <w:tc>
-          <w:tcPr>
-            <w:tcW w:w="910" w:type="dxa"/>
-          </w:tcPr>
-          <w:p>
-            <w:pPr/>
-            <w:r>
-              <w:t xml:space="preserve">2,800</w:t>
-            </w:r>
-          </w:p>
-        </w:tc>
-        <w:tc>
-          <w:tcPr>
-            <w:tcW w:w="830" w:type="dxa"/>
-          </w:tcPr>
-          <w:p>
-            <w:pPr/>
-            <w:r>
-              <w:t xml:space="preserve">8%</w:t>
-            </w:r>
-          </w:p>
-        </w:tc>
-        <w:tc>
-          <w:tcPr>
-            <w:tcW w:w="1305" w:type="dxa"/>
-          </w:tcPr>
-          <w:p>
-            <w:pPr/>
-            <w:r>
-              <w:t xml:space="preserve">60%</w:t>
-            </w:r>
-          </w:p>
-        </w:tc>
-        <w:tc>
-          <w:tcPr>
-            <w:tcW w:w="1225" w:type="dxa"/>
-          </w:tcPr>
-          <w:p>
-            <w:pPr/>
-            <w:r>
-              <w:t xml:space="preserve">9,860</w:t>
-            </w:r>
-          </w:p>
-        </w:tc>
-        <w:tc>
-          <w:tcPr>
-            <w:tcW w:w="2678" w:type="dxa"/>
-          </w:tcPr>
-          <w:p>
-            <w:pPr/>
-            <w:r>
-              <w:t xml:space="preserve">Move to preferred vendors, catalogs, marketplace</w:t>
-            </w:r>
-          </w:p>
-        </w:tc>
-      </w:tr>
-      <w:tr>
-        <w:tc>
-          <w:tcPr>
-            <w:tcW w:w="1186" w:type="dxa"/>
+              <w:t xml:space="preserve">One-time cost</w:t>
+            </w:r>
+          </w:p>
+        </w:tc>
+      </w:tr>
+      <w:tr>
+        <w:tc>
+          <w:tcPr>
+            <w:tcW w:w="1754" w:type="dxa"/>
           </w:tcPr>
           <w:p>
             <w:pPr/>
@@ -1444,13 +1209,24 @@
               <w:rPr>
                 <w:b/>
               </w:rPr>
-              <w:t xml:space="preserve">Total</w:t>
-            </w:r>
-          </w:p>
-        </w:tc>
-        <w:tc>
-          <w:tcPr>
-            <w:tcW w:w="1225" w:type="dxa"/>
+              <w:t xml:space="preserve">Conservative (recommended first)</w:t>
+            </w:r>
+          </w:p>
+        </w:tc>
+        <w:tc>
+          <w:tcPr>
+            <w:tcW w:w="2882" w:type="dxa"/>
+          </w:tcPr>
+          <w:p>
+            <w:pPr/>
+            <w:r>
+              <w:t xml:space="preserve">Merge duplicate records; move one-time vendors to catalogs</w:t>
+            </w:r>
+          </w:p>
+        </w:tc>
+        <w:tc>
+          <w:tcPr>
+            <w:tcW w:w="1237" w:type="dxa"/>
           </w:tcPr>
           <w:p>
             <w:pPr/>
@@ -1458,13 +1234,13 @@
               <w:rPr>
                 <w:b/>
               </w:rPr>
-              <w:t xml:space="preserve">29,000</w:t>
-            </w:r>
-          </w:p>
-        </w:tc>
-        <w:tc>
-          <w:tcPr>
-            <w:tcW w:w="910" w:type="dxa"/>
+              <w:t xml:space="preserve">21,800 (−27%)</w:t>
+            </w:r>
+          </w:p>
+        </w:tc>
+        <w:tc>
+          <w:tcPr>
+            <w:tcW w:w="1780" w:type="dxa"/>
           </w:tcPr>
           <w:p>
             <w:pPr/>
@@ -1472,13 +1248,13 @@
               <w:rPr>
                 <w:b/>
               </w:rPr>
-              <w:t xml:space="preserve">35,000</w:t>
-            </w:r>
-          </w:p>
-        </w:tc>
-        <w:tc>
-          <w:tcPr>
-            <w:tcW w:w="830" w:type="dxa"/>
+              <w:t xml:space="preserve">$356M</w:t>
+            </w:r>
+          </w:p>
+        </w:tc>
+        <w:tc>
+          <w:tcPr>
+            <w:tcW w:w="1707" w:type="dxa"/>
           </w:tcPr>
           <w:p>
             <w:pPr/>
@@ -1486,44 +1262,122 @@
               <w:rPr>
                 <w:b/>
               </w:rPr>
-              <w:t xml:space="preserve">100%</w:t>
-            </w:r>
-          </w:p>
-        </w:tc>
-        <w:tc>
-          <w:tcPr>
-            <w:tcW w:w="1305" w:type="dxa"/>
-          </w:tcPr>
-          <w:p>
-            <w:pPr/>
-            <w:r>
-              <w:rPr>
-                <w:b/>
-              </w:rPr>
-              <w:t xml:space="preserve">54%</w:t>
-            </w:r>
-          </w:p>
-        </w:tc>
-        <w:tc>
-          <w:tcPr>
-            <w:tcW w:w="1225" w:type="dxa"/>
-          </w:tcPr>
-          <w:p>
-            <w:pPr/>
-            <w:r>
-              <w:rPr>
-                <w:b/>
-              </w:rPr>
-              <w:t xml:space="preserve">13,268</w:t>
-            </w:r>
-          </w:p>
-        </w:tc>
-        <w:tc>
-          <w:tcPr>
-            <w:tcW w:w="2678" w:type="dxa"/>
-          </w:tcPr>
-          <w:p>
-            <w:pPr/>
+              <w:t xml:space="preserve">$34M</w:t>
+            </w:r>
+          </w:p>
+        </w:tc>
+      </w:tr>
+      <w:tr>
+        <w:tc>
+          <w:tcPr>
+            <w:tcW w:w="1754" w:type="dxa"/>
+          </w:tcPr>
+          <w:p>
+            <w:pPr/>
+            <w:r>
+              <w:t xml:space="preserve">Base</w:t>
+            </w:r>
+          </w:p>
+        </w:tc>
+        <w:tc>
+          <w:tcPr>
+            <w:tcW w:w="2882" w:type="dxa"/>
+          </w:tcPr>
+          <w:p>
+            <w:pPr/>
+            <w:r>
+              <w:t xml:space="preserve">+ consolidate within Leverage and Non-critical categories</w:t>
+            </w:r>
+          </w:p>
+        </w:tc>
+        <w:tc>
+          <w:tcPr>
+            <w:tcW w:w="1237" w:type="dxa"/>
+          </w:tcPr>
+          <w:p>
+            <w:pPr/>
+            <w:r>
+              <w:t xml:space="preserve">35,500 (−44%)</w:t>
+            </w:r>
+          </w:p>
+        </w:tc>
+        <w:tc>
+          <w:tcPr>
+            <w:tcW w:w="1780" w:type="dxa"/>
+          </w:tcPr>
+          <w:p>
+            <w:pPr/>
+            <w:r>
+              <w:t xml:space="preserve">$414M</w:t>
+            </w:r>
+          </w:p>
+        </w:tc>
+        <w:tc>
+          <w:tcPr>
+            <w:tcW w:w="1707" w:type="dxa"/>
+          </w:tcPr>
+          <w:p>
+            <w:pPr/>
+            <w:r>
+              <w:t xml:space="preserve">$73M</w:t>
+            </w:r>
+          </w:p>
+        </w:tc>
+      </w:tr>
+      <w:tr>
+        <w:tc>
+          <w:tcPr>
+            <w:tcW w:w="1754" w:type="dxa"/>
+          </w:tcPr>
+          <w:p>
+            <w:pPr/>
+            <w:r>
+              <w:t xml:space="preserve">Aggressive</w:t>
+            </w:r>
+          </w:p>
+        </w:tc>
+        <w:tc>
+          <w:tcPr>
+            <w:tcW w:w="2882" w:type="dxa"/>
+          </w:tcPr>
+          <w:p>
+            <w:pPr/>
+            <w:r>
+              <w:t xml:space="preserve">+ consolidate in Strategic and Bottleneck categories</w:t>
+            </w:r>
+          </w:p>
+        </w:tc>
+        <w:tc>
+          <w:tcPr>
+            <w:tcW w:w="1237" w:type="dxa"/>
+          </w:tcPr>
+          <w:p>
+            <w:pPr/>
+            <w:r>
+              <w:t xml:space="preserve">41,700 (−52%)</w:t>
+            </w:r>
+          </w:p>
+        </w:tc>
+        <w:tc>
+          <w:tcPr>
+            <w:tcW w:w="1780" w:type="dxa"/>
+          </w:tcPr>
+          <w:p>
+            <w:pPr/>
+            <w:r>
+              <w:t xml:space="preserve">$427M</w:t>
+            </w:r>
+          </w:p>
+        </w:tc>
+        <w:tc>
+          <w:tcPr>
+            <w:tcW w:w="1707" w:type="dxa"/>
+          </w:tcPr>
+          <w:p>
+            <w:pPr/>
+            <w:r>
+              <w:t xml:space="preserve">$91M</w:t>
+            </w:r>
           </w:p>
         </w:tc>
       </w:tr>
@@ -1662,9 +1516,9 @@
       </w:tblPr>
       <w:tblGrid>
         <w:gridCol w:w="1344"/>
-        <w:gridCol w:w="1700"/>
-        <w:gridCol w:w="4427"/>
-        <w:gridCol w:w="1889"/>
+        <w:gridCol w:w="1558"/>
+        <w:gridCol w:w="4730"/>
+        <w:gridCol w:w="1728"/>
       </w:tblGrid>
       <w:tr>
         <w:trPr>
@@ -1684,7 +1538,7 @@
         </w:tc>
         <w:tc>
           <w:tcPr>
-            <w:tcW w:w="1700" w:type="dxa"/>
+            <w:tcW w:w="1558" w:type="dxa"/>
             <w:shd w:val="clear" w:color="auto" w:fill="F2F2F2"/>
           </w:tcPr>
           <w:p>
@@ -1696,7 +1550,7 @@
         </w:tc>
         <w:tc>
           <w:tcPr>
-            <w:tcW w:w="4427" w:type="dxa"/>
+            <w:tcW w:w="4730" w:type="dxa"/>
             <w:shd w:val="clear" w:color="auto" w:fill="F2F2F2"/>
           </w:tcPr>
           <w:p>
@@ -1708,7 +1562,7 @@
         </w:tc>
         <w:tc>
           <w:tcPr>
-            <w:tcW w:w="1889" w:type="dxa"/>
+            <w:tcW w:w="1728" w:type="dxa"/>
             <w:shd w:val="clear" w:color="auto" w:fill="F2F2F2"/>
           </w:tcPr>
           <w:p>
@@ -1733,7 +1587,7 @@
         </w:tc>
         <w:tc>
           <w:tcPr>
-            <w:tcW w:w="1700" w:type="dxa"/>
+            <w:tcW w:w="1558" w:type="dxa"/>
           </w:tcPr>
           <w:p>
             <w:pPr/>
@@ -1744,7 +1598,7 @@
         </w:tc>
         <w:tc>
           <w:tcPr>
-            <w:tcW w:w="4427" w:type="dxa"/>
+            <w:tcW w:w="4730" w:type="dxa"/>
           </w:tcPr>
           <w:p>
             <w:pPr/>
@@ -1755,7 +1609,7 @@
         </w:tc>
         <w:tc>
           <w:tcPr>
-            <w:tcW w:w="1889" w:type="dxa"/>
+            <w:tcW w:w="1728" w:type="dxa"/>
           </w:tcPr>
           <w:p>
             <w:pPr/>
@@ -1785,7 +1639,7 @@
         </w:tc>
         <w:tc>
           <w:tcPr>
-            <w:tcW w:w="1700" w:type="dxa"/>
+            <w:tcW w:w="1558" w:type="dxa"/>
           </w:tcPr>
           <w:p>
             <w:pPr/>
@@ -1796,7 +1650,7 @@
         </w:tc>
         <w:tc>
           <w:tcPr>
-            <w:tcW w:w="4427" w:type="dxa"/>
+            <w:tcW w:w="4730" w:type="dxa"/>
           </w:tcPr>
           <w:p>
             <w:pPr/>
@@ -1807,7 +1661,7 @@
         </w:tc>
         <w:tc>
           <w:tcPr>
-            <w:tcW w:w="1889" w:type="dxa"/>
+            <w:tcW w:w="1728" w:type="dxa"/>
           </w:tcPr>
           <w:p>
             <w:pPr/>
@@ -1837,7 +1691,7 @@
         </w:tc>
         <w:tc>
           <w:tcPr>
-            <w:tcW w:w="1700" w:type="dxa"/>
+            <w:tcW w:w="1558" w:type="dxa"/>
           </w:tcPr>
           <w:p>
             <w:pPr/>
@@ -1848,7 +1702,7 @@
         </w:tc>
         <w:tc>
           <w:tcPr>
-            <w:tcW w:w="4427" w:type="dxa"/>
+            <w:tcW w:w="4730" w:type="dxa"/>
           </w:tcPr>
           <w:p>
             <w:pPr/>
@@ -1859,7 +1713,7 @@
         </w:tc>
         <w:tc>
           <w:tcPr>
-            <w:tcW w:w="1889" w:type="dxa"/>
+            <w:tcW w:w="1728" w:type="dxa"/>
           </w:tcPr>
           <w:p>
             <w:pPr/>
@@ -1883,7 +1737,7 @@
         </w:tc>
         <w:tc>
           <w:tcPr>
-            <w:tcW w:w="1700" w:type="dxa"/>
+            <w:tcW w:w="1558" w:type="dxa"/>
           </w:tcPr>
           <w:p>
             <w:pPr/>
@@ -1894,18 +1748,18 @@
         </w:tc>
         <w:tc>
           <w:tcPr>
-            <w:tcW w:w="4427" w:type="dxa"/>
-          </w:tcPr>
-          <w:p>
-            <w:pPr/>
-            <w:r>
-              <w:t xml:space="preserve">858 duplicate records found (TF-IDF name matching); 4,648 kept, 8,824 exited, 2,623 consolidated, 838 merged</w:t>
-            </w:r>
-          </w:p>
-        </w:tc>
-        <w:tc>
-          <w:tcPr>
-            <w:tcW w:w="1889" w:type="dxa"/>
+            <w:tcW w:w="4730" w:type="dxa"/>
+          </w:tcPr>
+          <w:p>
+            <w:pPr/>
+            <w:r>
+              <w:t xml:space="preserve">858 duplicate records found (TF-IDF name matching); 4,649 of 16,933 supplier records kept over three years. On one year of active suppliers (8,226): −27% conservative, −44% base, −52% aggressive</w:t>
+            </w:r>
+          </w:p>
+        </w:tc>
+        <w:tc>
+          <w:tcPr>
+            <w:tcW w:w="1728" w:type="dxa"/>
           </w:tcPr>
           <w:p>
             <w:pPr/>
@@ -1929,7 +1783,7 @@
         </w:tc>
         <w:tc>
           <w:tcPr>
-            <w:tcW w:w="1700" w:type="dxa"/>
+            <w:tcW w:w="1558" w:type="dxa"/>
           </w:tcPr>
           <w:p>
             <w:pPr/>
@@ -1940,7 +1794,7 @@
         </w:tc>
         <w:tc>
           <w:tcPr>
-            <w:tcW w:w="4427" w:type="dxa"/>
+            <w:tcW w:w="4730" w:type="dxa"/>
           </w:tcPr>
           <w:p>
             <w:pPr/>
@@ -1960,7 +1814,7 @@
         </w:tc>
         <w:tc>
           <w:tcPr>
-            <w:tcW w:w="1889" w:type="dxa"/>
+            <w:tcW w:w="1728" w:type="dxa"/>
           </w:tcPr>
           <w:p>
             <w:pPr/>
@@ -2202,6 +2056,208 @@
         <w:pStyle w:val="Heading2"/>
       </w:pPr>
       <w:r>
+        <w:t xml:space="preserve">Small cut, big impact</w:t>
+      </w:r>
+    </w:p>
+    <w:p>
+      <w:pPr/>
+      <w:r>
+        <w:t xml:space="preserve">The savings depend little on how many suppliers are cut. The conservative tier keeps 86% of the base-case value with 61% of the cuts, because most of the value is the re-tender of suppliers J&amp;J keeps: 152 of the 1,649 kept Leverage suppliers hold 80% of that spend. Negotiating with about 150 large suppliers is worth more than cutting thousands of small ones.</w:t>
+      </w:r>
+    </w:p>
+    <w:p>
+      <w:pPr>
+        <w:pStyle w:val="Heading2"/>
+      </w:pPr>
+      <w:r>
+        <w:t xml:space="preserve">Phase 2: going further from ~39,000</w:t>
+      </w:r>
+    </w:p>
+    <w:p>
+      <w:pPr/>
+      <w:r>
+        <w:t xml:space="preserve">Once the easy cuts are made, most remaining suppliers are legitimate, so a different model is needed: a target count per category. Keep the fewest suppliers covering 90% of the category's spend, with at least two in Strategic and Bottleneck categories, and always keep strategic, sole-source and small/diverse suppliers.</w:t>
+      </w:r>
+    </w:p>
+    <w:tbl>
+      <w:tblPr>
+        <w:tblStyle w:val="TableGrid"/>
+        <w:tblW w:w="0" w:type="auto"/>
+        <w:tblLayout w:type="fixed"/>
+        <w:tblLook w:val="04A0" w:firstRow="1" w:lastRow="0" w:firstColumn="0" w:lastColumn="0" w:noHBand="0" w:noVBand="1"/>
+      </w:tblPr>
+      <w:tblGrid>
+        <w:gridCol w:w="4405"/>
+        <w:gridCol w:w="2201"/>
+        <w:gridCol w:w="2752"/>
+      </w:tblGrid>
+      <w:tr>
+        <w:trPr>
+          <w:tblHeader/>
+        </w:trPr>
+        <w:tc>
+          <w:tcPr>
+            <w:tcW w:w="4405" w:type="dxa"/>
+            <w:shd w:val="clear" w:color="auto" w:fill="F2F2F2"/>
+          </w:tcPr>
+          <w:p>
+            <w:pPr/>
+            <w:r>
+              <w:t xml:space="preserve">Spend coverage target</w:t>
+            </w:r>
+          </w:p>
+        </w:tc>
+        <w:tc>
+          <w:tcPr>
+            <w:tcW w:w="2201" w:type="dxa"/>
+            <w:shd w:val="clear" w:color="auto" w:fill="F2F2F2"/>
+          </w:tcPr>
+          <w:p>
+            <w:pPr/>
+            <w:r>
+              <w:t xml:space="preserve">Reduction</w:t>
+            </w:r>
+          </w:p>
+        </w:tc>
+        <w:tc>
+          <w:tcPr>
+            <w:tcW w:w="2752" w:type="dxa"/>
+            <w:shd w:val="clear" w:color="auto" w:fill="F2F2F2"/>
+          </w:tcPr>
+          <w:p>
+            <w:pPr/>
+            <w:r>
+              <w:t xml:space="preserve">J&amp;J suppliers</w:t>
+            </w:r>
+          </w:p>
+        </w:tc>
+      </w:tr>
+      <w:tr>
+        <w:tc>
+          <w:tcPr>
+            <w:tcW w:w="4405" w:type="dxa"/>
+          </w:tcPr>
+          <w:p>
+            <w:pPr/>
+            <w:r>
+              <w:t xml:space="preserve">80%</w:t>
+            </w:r>
+          </w:p>
+        </w:tc>
+        <w:tc>
+          <w:tcPr>
+            <w:tcW w:w="2201" w:type="dxa"/>
+          </w:tcPr>
+          <w:p>
+            <w:pPr/>
+            <w:r>
+              <w:t xml:space="preserve">−22%</w:t>
+            </w:r>
+          </w:p>
+        </w:tc>
+        <w:tc>
+          <w:tcPr>
+            <w:tcW w:w="2752" w:type="dxa"/>
+          </w:tcPr>
+          <w:p>
+            <w:pPr/>
+            <w:r>
+              <w:t xml:space="preserve">~30,500</w:t>
+            </w:r>
+          </w:p>
+        </w:tc>
+      </w:tr>
+      <w:tr>
+        <w:tc>
+          <w:tcPr>
+            <w:tcW w:w="4405" w:type="dxa"/>
+          </w:tcPr>
+          <w:p>
+            <w:pPr/>
+            <w:r>
+              <w:rPr>
+                <w:b/>
+              </w:rPr>
+              <w:t xml:space="preserve">90% (recommended)</w:t>
+            </w:r>
+          </w:p>
+        </w:tc>
+        <w:tc>
+          <w:tcPr>
+            <w:tcW w:w="2201" w:type="dxa"/>
+          </w:tcPr>
+          <w:p>
+            <w:pPr/>
+            <w:r>
+              <w:rPr>
+                <w:b/>
+              </w:rPr>
+              <w:t xml:space="preserve">−18%</w:t>
+            </w:r>
+          </w:p>
+        </w:tc>
+        <w:tc>
+          <w:tcPr>
+            <w:tcW w:w="2752" w:type="dxa"/>
+          </w:tcPr>
+          <w:p>
+            <w:pPr/>
+            <w:r>
+              <w:rPr>
+                <w:b/>
+              </w:rPr>
+              <w:t xml:space="preserve">~32,100</w:t>
+            </w:r>
+          </w:p>
+        </w:tc>
+      </w:tr>
+      <w:tr>
+        <w:tc>
+          <w:tcPr>
+            <w:tcW w:w="4405" w:type="dxa"/>
+          </w:tcPr>
+          <w:p>
+            <w:pPr/>
+            <w:r>
+              <w:t xml:space="preserve">95%</w:t>
+            </w:r>
+          </w:p>
+        </w:tc>
+        <w:tc>
+          <w:tcPr>
+            <w:tcW w:w="2201" w:type="dxa"/>
+          </w:tcPr>
+          <w:p>
+            <w:pPr/>
+            <w:r>
+              <w:t xml:space="preserve">−14%</w:t>
+            </w:r>
+          </w:p>
+        </w:tc>
+        <w:tc>
+          <w:tcPr>
+            <w:tcW w:w="2752" w:type="dxa"/>
+          </w:tcPr>
+          <w:p>
+            <w:pPr/>
+            <w:r>
+              <w:t xml:space="preserve">~33,700</w:t>
+            </w:r>
+          </w:p>
+        </w:tc>
+      </w:tr>
+    </w:tbl>
+    <w:p>
+      <w:pPr/>
+      <w:r>
+        <w:t xml:space="preserve">Only 1.5% of the year's spend changes supplier, and the number of categories dominated by one supplier does not change. Phase 2 saves about $14M a year in supplier management, not big price savings.</w:t>
+      </w:r>
+    </w:p>
+    <w:p>
+      <w:pPr>
+        <w:pStyle w:val="Heading2"/>
+      </w:pPr>
+      <w:r>
         <w:t xml:space="preserve">Financial case</w:t>
       </w:r>
     </w:p>
@@ -2232,7 +2288,7 @@
                     <pic:cNvPicPr/>
                   </pic:nvPicPr>
                   <pic:blipFill>
-                    <a:blip r:embed="rId8"/>
+                    <a:blip r:embed="rId7"/>
                     <a:stretch>
                       <a:fillRect/>
                     </a:stretch>
@@ -2658,16 +2714,16 @@
         <w:drawing>
           <wp:inline distT="0" distB="0" distL="0" distR="0">
             <wp:extent cx="5486400" cy="2939142"/>
-            <wp:docPr id="2" name="image2" descr="scripts/05_savings.py on the real supplier list, scaled to J&amp;J ($35B spend, 29,000 suppliers)"/>
+            <wp:docPr id="2" name="image2" descr="scripts/05_savings.py on the real supplier list, scaled to J&amp;J ($35B spend; 80,000 suppliers ÷ 8,226 active in one year)"/>
             <a:graphic xmlns:a="http://schemas.openxmlformats.org/drawingml/2006/main">
               <a:graphicData uri="http://schemas.openxmlformats.org/drawingml/2006/picture">
                 <pic:pic xmlns:pic="http://schemas.openxmlformats.org/drawingml/2006/picture">
                   <pic:nvPicPr>
-                    <pic:cNvPr id="2" name="image2" descr="scripts/05_savings.py on the real supplier list, scaled to J&amp;J ($35B spend, 29,000 suppliers)"/>
+                    <pic:cNvPr id="2" name="image2" descr="scripts/05_savings.py on the real supplier list, scaled to J&amp;J ($35B spend; 80,000 suppliers ÷ 8,226 active in one year)"/>
                     <pic:cNvPicPr/>
                   </pic:nvPicPr>
                   <pic:blipFill>
-                    <a:blip r:embed="rId9"/>
+                    <a:blip r:embed="rId8"/>
                     <a:stretch>
                       <a:fillRect/>
                     </a:stretch>
@@ -2691,7 +2747,7 @@
     <w:p>
       <w:pPr/>
       <w:r>
-        <w:t xml:space="preserve">scripts/05_savings.py on the real supplier list, scaled to J&amp;J ($35B spend, 29,000 suppliers)</w:t>
+        <w:t xml:space="preserve">scripts/05_savings.py on the real supplier list, scaled to J&amp;J ($35B spend; 80,000 suppliers ÷ 8,226 active in one year)</w:t>
       </w:r>
     </w:p>
     <w:tbl>
@@ -2814,7 +2870,7 @@
           <w:p>
             <w:pPr/>
             <w:r>
-              <w:t xml:space="preserve">Fewer active suppliers to maintain</w:t>
+              <w:t xml:space="preserve">Fewer suppliers to manage (scaled from 80,000)</w:t>
             </w:r>
           </w:p>
         </w:tc>
@@ -2825,7 +2881,7 @@
           <w:p>
             <w:pPr/>
             <w:r>
-              <w:t xml:space="preserve">11</w:t>
+              <w:t xml:space="preserve">22</w:t>
             </w:r>
           </w:p>
         </w:tc>
@@ -2836,7 +2892,7 @@
           <w:p>
             <w:pPr/>
             <w:r>
-              <w:t xml:space="preserve">23</w:t>
+              <w:t xml:space="preserve">71</w:t>
             </w:r>
           </w:p>
         </w:tc>
@@ -2847,7 +2903,7 @@
           <w:p>
             <w:pPr/>
             <w:r>
-              <w:t xml:space="preserve">34</w:t>
+              <w:t xml:space="preserve">125</w:t>
             </w:r>
           </w:p>
         </w:tc>
@@ -2923,7 +2979,7 @@
               <w:rPr>
                 <w:b/>
               </w:rPr>
-              <w:t xml:space="preserve">105</w:t>
+              <w:t xml:space="preserve">115</w:t>
             </w:r>
           </w:p>
         </w:tc>
@@ -2937,7 +2993,7 @@
               <w:rPr>
                 <w:b/>
               </w:rPr>
-              <w:t xml:space="preserve">366</w:t>
+              <w:t xml:space="preserve">414</w:t>
             </w:r>
           </w:p>
         </w:tc>
@@ -2951,7 +3007,7 @@
               <w:rPr>
                 <w:b/>
               </w:rPr>
-              <w:t xml:space="preserve">721</w:t>
+              <w:t xml:space="preserve">811</w:t>
             </w:r>
           </w:p>
         </w:tc>
@@ -2975,7 +3031,7 @@
           <w:p>
             <w:pPr/>
             <w:r>
-              <w:t xml:space="preserve">40</w:t>
+              <w:t xml:space="preserve">34</w:t>
             </w:r>
           </w:p>
         </w:tc>
@@ -2986,7 +3042,7 @@
           <w:p>
             <w:pPr/>
             <w:r>
-              <w:t xml:space="preserve">40</w:t>
+              <w:t xml:space="preserve">73</w:t>
             </w:r>
           </w:p>
         </w:tc>
@@ -2997,7 +3053,7 @@
           <w:p>
             <w:pPr/>
             <w:r>
-              <w:t xml:space="preserve">40</w:t>
+              <w:t xml:space="preserve">91</w:t>
             </w:r>
           </w:p>
         </w:tc>
@@ -3021,7 +3077,7 @@
           <w:p>
             <w:pPr/>
             <w:r>
-              <w:t xml:space="preserve">135</w:t>
+              <w:t xml:space="preserve">158</w:t>
             </w:r>
           </w:p>
         </w:tc>
@@ -3032,7 +3088,7 @@
           <w:p>
             <w:pPr/>
             <w:r>
-              <w:t xml:space="preserve">572</w:t>
+              <w:t xml:space="preserve">619</w:t>
             </w:r>
           </w:p>
         </w:tc>
@@ -3043,7 +3099,7 @@
           <w:p>
             <w:pPr/>
             <w:r>
-              <w:t xml:space="preserve">1,165</w:t>
+              <w:t xml:space="preserve">1,265</w:t>
             </w:r>
           </w:p>
         </w:tc>
@@ -3110,10 +3166,10 @@
         <w:rPr>
           <w:b/>
         </w:rPr>
-        <w:t xml:space="preserve">at least 1.15%</w:t>
-      </w:r>
-      <w:r>
-        <w:t xml:space="preserve"> for the base case to clear $300M. The MSA template's volume tiers and benchmark clause are how that saving is captured and measured.</w:t>
+        <w:t xml:space="preserve">at least 0.89%</w:t>
+      </w:r>
+      <w:r>
+        <w:t xml:space="preserve"> for the base case to clear $300M (1.2% in the conservative plan). The MSA template's volume tiers and benchmark clause are how that saving is captured and measured.</w:t>
       </w:r>
     </w:p>
     <w:p>
@@ -3690,7 +3746,7 @@
       <w:r>
         <w:t xml:space="preserve">The clauses mirror real J&amp;J contracts read in the SEC filings: notice periods (Alkermes), fixed term with extension option (MeiraGTx) and technology transfer (Mersana). Full text: </w:t>
       </w:r>
-      <w:hyperlink r:id="rId10" w:history="1">
+      <w:hyperlink r:id="rId9" w:history="1">
         <w:r>
           <w:rPr>
             <w:rStyle w:val="Hyperlink"/>
@@ -4009,7 +4065,7 @@
                     <pic:cNvPicPr/>
                   </pic:nvPicPr>
                   <pic:blipFill>
-                    <a:blip r:embed="rId11"/>
+                    <a:blip r:embed="rId10"/>
                     <a:stretch>
                       <a:fillRect/>
                     </a:stretch>
@@ -4044,9 +4100,9 @@
         <w:tblLook w:val="04A0" w:firstRow="1" w:lastRow="0" w:firstColumn="0" w:lastColumn="0" w:noHBand="0" w:noVBand="1"/>
       </w:tblPr>
       <w:tblGrid>
-        <w:gridCol w:w="4920"/>
-        <w:gridCol w:w="1344"/>
-        <w:gridCol w:w="3096"/>
+        <w:gridCol w:w="4448"/>
+        <w:gridCol w:w="2056"/>
+        <w:gridCol w:w="2855"/>
       </w:tblGrid>
       <w:tr>
         <w:trPr>
@@ -4054,7 +4110,7 @@
         </w:trPr>
         <w:tc>
           <w:tcPr>
-            <w:tcW w:w="4920" w:type="dxa"/>
+            <w:tcW w:w="4448" w:type="dxa"/>
             <w:shd w:val="clear" w:color="auto" w:fill="F2F2F2"/>
           </w:tcPr>
           <w:p>
@@ -4066,7 +4122,7 @@
         </w:tc>
         <w:tc>
           <w:tcPr>
-            <w:tcW w:w="1344" w:type="dxa"/>
+            <w:tcW w:w="2056" w:type="dxa"/>
             <w:shd w:val="clear" w:color="auto" w:fill="F2F2F2"/>
           </w:tcPr>
           <w:p>
@@ -4078,7 +4134,7 @@
         </w:tc>
         <w:tc>
           <w:tcPr>
-            <w:tcW w:w="3096" w:type="dxa"/>
+            <w:tcW w:w="2855" w:type="dxa"/>
             <w:shd w:val="clear" w:color="auto" w:fill="F2F2F2"/>
           </w:tcPr>
           <w:p>
@@ -4092,7 +4148,7 @@
       <w:tr>
         <w:tc>
           <w:tcPr>
-            <w:tcW w:w="4920" w:type="dxa"/>
+            <w:tcW w:w="4448" w:type="dxa"/>
           </w:tcPr>
           <w:p>
             <w:pPr/>
@@ -4103,31 +4159,31 @@
         </w:tc>
         <w:tc>
           <w:tcPr>
-            <w:tcW w:w="1344" w:type="dxa"/>
-          </w:tcPr>
-          <w:p>
-            <w:pPr/>
-            <w:r>
-              <w:t xml:space="preserve">~29,000</w:t>
-            </w:r>
-          </w:p>
-        </w:tc>
-        <w:tc>
-          <w:tcPr>
-            <w:tcW w:w="3096" w:type="dxa"/>
-          </w:tcPr>
-          <w:p>
-            <w:pPr/>
-            <w:r>
-              <w:t xml:space="preserve">~11,900 (−59% of active base)</w:t>
-            </w:r>
-          </w:p>
-        </w:tc>
-      </w:tr>
-      <w:tr>
-        <w:tc>
-          <w:tcPr>
-            <w:tcW w:w="4920" w:type="dxa"/>
+            <w:tcW w:w="2056" w:type="dxa"/>
+          </w:tcPr>
+          <w:p>
+            <w:pPr/>
+            <w:r>
+              <w:t xml:space="preserve">~39,000 (FY2025)</w:t>
+            </w:r>
+          </w:p>
+        </w:tc>
+        <w:tc>
+          <w:tcPr>
+            <w:tcW w:w="2855" w:type="dxa"/>
+          </w:tcPr>
+          <w:p>
+            <w:pPr/>
+            <w:r>
+              <w:t xml:space="preserve">~32,100 (Phase 2)</w:t>
+            </w:r>
+          </w:p>
+        </w:tc>
+      </w:tr>
+      <w:tr>
+        <w:tc>
+          <w:tcPr>
+            <w:tcW w:w="4448" w:type="dxa"/>
           </w:tcPr>
           <w:p>
             <w:pPr/>
@@ -4138,7 +4194,7 @@
         </w:tc>
         <w:tc>
           <w:tcPr>
-            <w:tcW w:w="1344" w:type="dxa"/>
+            <w:tcW w:w="2056" w:type="dxa"/>
           </w:tcPr>
           <w:p>
             <w:pPr/>
@@ -4149,20 +4205,20 @@
         </w:tc>
         <w:tc>
           <w:tcPr>
-            <w:tcW w:w="3096" w:type="dxa"/>
-          </w:tcPr>
-          <w:p>
-            <w:pPr/>
-            <w:r>
-              <w:t xml:space="preserve">$366M a year (base case)</w:t>
-            </w:r>
-          </w:p>
-        </w:tc>
-      </w:tr>
-      <w:tr>
-        <w:tc>
-          <w:tcPr>
-            <w:tcW w:w="4920" w:type="dxa"/>
+            <w:tcW w:w="2855" w:type="dxa"/>
+          </w:tcPr>
+          <w:p>
+            <w:pPr/>
+            <w:r>
+              <w:t xml:space="preserve">$356M a year (conservative plan); $414M base</w:t>
+            </w:r>
+          </w:p>
+        </w:tc>
+      </w:tr>
+      <w:tr>
+        <w:tc>
+          <w:tcPr>
+            <w:tcW w:w="4448" w:type="dxa"/>
           </w:tcPr>
           <w:p>
             <w:pPr/>
@@ -4173,7 +4229,7 @@
         </w:tc>
         <w:tc>
           <w:tcPr>
-            <w:tcW w:w="1344" w:type="dxa"/>
+            <w:tcW w:w="2056" w:type="dxa"/>
           </w:tcPr>
           <w:p>
             <w:pPr/>
@@ -4184,7 +4240,7 @@
         </w:tc>
         <w:tc>
           <w:tcPr>
-            <w:tcW w:w="3096" w:type="dxa"/>
+            <w:tcW w:w="2855" w:type="dxa"/>
           </w:tcPr>
           <w:p>
             <w:pPr/>
@@ -4197,7 +4253,7 @@
       <w:tr>
         <w:tc>
           <w:tcPr>
-            <w:tcW w:w="4920" w:type="dxa"/>
+            <w:tcW w:w="4448" w:type="dxa"/>
           </w:tcPr>
           <w:p>
             <w:pPr/>
@@ -4208,7 +4264,7 @@
         </w:tc>
         <w:tc>
           <w:tcPr>
-            <w:tcW w:w="1344" w:type="dxa"/>
+            <w:tcW w:w="2056" w:type="dxa"/>
           </w:tcPr>
           <w:p>
             <w:pPr/>
@@ -4219,7 +4275,7 @@
         </w:tc>
         <w:tc>
           <w:tcPr>
-            <w:tcW w:w="3096" w:type="dxa"/>
+            <w:tcW w:w="2855" w:type="dxa"/>
           </w:tcPr>
           <w:p>
             <w:pPr/>
@@ -4232,7 +4288,7 @@
       <w:tr>
         <w:tc>
           <w:tcPr>
-            <w:tcW w:w="4920" w:type="dxa"/>
+            <w:tcW w:w="4448" w:type="dxa"/>
           </w:tcPr>
           <w:p>
             <w:pPr/>
@@ -4243,7 +4299,7 @@
         </w:tc>
         <w:tc>
           <w:tcPr>
-            <w:tcW w:w="1344" w:type="dxa"/>
+            <w:tcW w:w="2056" w:type="dxa"/>
           </w:tcPr>
           <w:p>
             <w:pPr/>
@@ -4254,7 +4310,7 @@
         </w:tc>
         <w:tc>
           <w:tcPr>
-            <w:tcW w:w="3096" w:type="dxa"/>
+            <w:tcW w:w="2855" w:type="dxa"/>
           </w:tcPr>
           <w:p>
             <w:pPr/>
@@ -4267,7 +4323,7 @@
       <w:tr>
         <w:tc>
           <w:tcPr>
-            <w:tcW w:w="4920" w:type="dxa"/>
+            <w:tcW w:w="4448" w:type="dxa"/>
           </w:tcPr>
           <w:p>
             <w:pPr/>
@@ -4278,7 +4334,7 @@
         </w:tc>
         <w:tc>
           <w:tcPr>
-            <w:tcW w:w="1344" w:type="dxa"/>
+            <w:tcW w:w="2056" w:type="dxa"/>
           </w:tcPr>
           <w:p>
             <w:pPr/>
@@ -4289,7 +4345,7 @@
         </w:tc>
         <w:tc>
           <w:tcPr>
-            <w:tcW w:w="3096" w:type="dxa"/>
+            <w:tcW w:w="2855" w:type="dxa"/>
           </w:tcPr>
           <w:p>
             <w:pPr/>
@@ -4366,7 +4422,7 @@
           </w:tcPr>
           <w:p>
             <w:pPr/>
-            <w:hyperlink r:id="rId12" w:history="1">
+            <w:hyperlink r:id="rId11" w:history="1">
               <w:r>
                 <w:rPr>
                   <w:rStyle w:val="Hyperlink"/>
@@ -4395,7 +4451,7 @@
           </w:tcPr>
           <w:p>
             <w:pPr/>
-            <w:hyperlink r:id="rId13" w:history="1">
+            <w:hyperlink r:id="rId12" w:history="1">
               <w:r>
                 <w:rPr>
                   <w:rStyle w:val="Hyperlink"/>
@@ -4424,7 +4480,7 @@
           </w:tcPr>
           <w:p>
             <w:pPr/>
-            <w:hyperlink r:id="rId14" w:history="1">
+            <w:hyperlink r:id="rId13" w:history="1">
               <w:r>
                 <w:rPr>
                   <w:rStyle w:val="Hyperlink"/>
@@ -4453,7 +4509,7 @@
           </w:tcPr>
           <w:p>
             <w:pPr/>
-            <w:hyperlink r:id="rId15" w:history="1">
+            <w:hyperlink r:id="rId14" w:history="1">
               <w:r>
                 <w:rPr>
                   <w:rStyle w:val="Hyperlink"/>
@@ -4586,7 +4642,7 @@
           <w:p>
             <w:pPr/>
             <w:r>
-              <w:t xml:space="preserve">29,000</w:t>
+              <w:t xml:space="preserve">80,000 (earlier); ~39,000 (FY2025)</w:t>
             </w:r>
           </w:p>
         </w:tc>
@@ -4765,40 +4821,6 @@
       <w:r>
         <w:t xml:space="preserve">Sources:</w:t>
       </w:r>
-    </w:p>
-    <w:p>
-      <w:pPr>
-        <w:pStyle w:val="ListParagraph"/>
-        <w:numPr>
-          <w:ilvl w:val="0"/>
-          <w:numId w:val="5"/>
-        </w:numPr>
-      </w:pPr>
-      <w:hyperlink r:id="rId3" w:history="1">
-        <w:r>
-          <w:rPr>
-            <w:rStyle w:val="Hyperlink"/>
-          </w:rPr>
-          <w:t xml:space="preserve">J&amp;J 2024 Health for Humanity Report</w:t>
-        </w:r>
-      </w:hyperlink>
-    </w:p>
-    <w:p>
-      <w:pPr>
-        <w:pStyle w:val="ListParagraph"/>
-        <w:numPr>
-          <w:ilvl w:val="0"/>
-          <w:numId w:val="5"/>
-        </w:numPr>
-      </w:pPr>
-      <w:hyperlink r:id="rId4" w:history="1">
-        <w:r>
-          <w:rPr>
-            <w:rStyle w:val="Hyperlink"/>
-          </w:rPr>
-          <w:t xml:space="preserve">J&amp;J 2023 Health for Humanity Report</w:t>
-        </w:r>
-      </w:hyperlink>
     </w:p>
     <w:p>
       <w:pPr>
@@ -4813,7 +4835,7 @@
           <w:rPr>
             <w:rStyle w:val="Hyperlink"/>
           </w:rPr>
-          <w:t xml:space="preserve">J&amp;J careers: Director, Procurement Global Process Owner</w:t>
+          <w:t xml:space="preserve">J&amp;J 2024 Health for Humanity Report</w:t>
         </w:r>
       </w:hyperlink>
     </w:p>
@@ -4825,7 +4847,41 @@
           <w:numId w:val="5"/>
         </w:numPr>
       </w:pPr>
-      <w:hyperlink r:id="rId6" w:history="1">
+      <w:hyperlink r:id="rId15" w:history="1">
+        <w:r>
+          <w:rPr>
+            <w:rStyle w:val="Hyperlink"/>
+          </w:rPr>
+          <w:t xml:space="preserve">J&amp;J 2023 Health for Humanity Report</w:t>
+        </w:r>
+      </w:hyperlink>
+    </w:p>
+    <w:p>
+      <w:pPr>
+        <w:pStyle w:val="ListParagraph"/>
+        <w:numPr>
+          <w:ilvl w:val="0"/>
+          <w:numId w:val="5"/>
+        </w:numPr>
+      </w:pPr>
+      <w:hyperlink r:id="rId16" w:history="1">
+        <w:r>
+          <w:rPr>
+            <w:rStyle w:val="Hyperlink"/>
+          </w:rPr>
+          <w:t xml:space="preserve">J&amp;J careers: Director, Procurement Global Process Owner</w:t>
+        </w:r>
+      </w:hyperlink>
+    </w:p>
+    <w:p>
+      <w:pPr>
+        <w:pStyle w:val="ListParagraph"/>
+        <w:numPr>
+          <w:ilvl w:val="0"/>
+          <w:numId w:val="5"/>
+        </w:numPr>
+      </w:pPr>
+      <w:hyperlink r:id="rId17" w:history="1">
         <w:r>
           <w:rPr>
             <w:rStyle w:val="Hyperlink"/>
@@ -4842,7 +4898,7 @@
           <w:numId w:val="5"/>
         </w:numPr>
       </w:pPr>
-      <w:hyperlink r:id="rId7" w:history="1">
+      <w:hyperlink r:id="rId18" w:history="1">
         <w:r>
           <w:rPr>
             <w:rStyle w:val="Hyperlink"/>

</xml_diff>